<commit_message>
docs: regenerate the Word manual from the updated markdown
The .docx is built from the markdown through tools/md_to_word_html.py and
LibreOffice; leaving it behind would hand staff a manual with no mention of the
calendar, the coverage notices or the notification bell.

Rebuilt with the same pipeline that produced the committed copy - confirmed by
the Word style structure, which is unchanged apart from the three new subsections
and their tables.

The bespoke web version, docs/user-manual.html, is hand-built rather than
generated and is therefore NOT updated here; it still describes the portal as it
was before these three features.
</commit_message>
<xml_diff>
--- a/docs/08_USER_MANUAL.docx
+++ b/docs/08_USER_MANUAL.docx
@@ -1102,14 +1102,26 @@
     </w:tbl>
     <w:p>
       <w:pPr>
-        <w:pStyle w:val="Heading3"/>
-        <w:bidi w:val="0"/>
-        <w:jc w:val="left"/>
-        <w:rPr/>
-      </w:pPr>
-      <w:r>
-        <w:rPr/>
-        <w:t>Applying for leave</w:t>
+        <w:pStyle w:val="BodyText"/>
+        <w:bidi w:val="0"/>
+        <w:jc w:val="left"/>
+        <w:rPr/>
+      </w:pPr>
+      <w:r>
+        <w:rPr/>
+        <w:t>The bar across each tile shows how much of that allocation is already committed — solid for days taken, amber for days still awaiting approval.</w:t>
+      </w:r>
+    </w:p>
+    <w:p>
+      <w:pPr>
+        <w:pStyle w:val="BodyText"/>
+        <w:bidi w:val="0"/>
+        <w:jc w:val="left"/>
+        <w:rPr/>
+      </w:pPr>
+      <w:r>
+        <w:rPr/>
+        <w:t>Above the tiles:</w:t>
       </w:r>
     </w:p>
     <w:p>
@@ -1130,28 +1142,14 @@
         <w:rPr/>
       </w:pPr>
       <w:r>
-        <w:rPr/>
-        <w:t xml:space="preserve">Select </w:t>
-      </w:r>
-      <w:r>
         <w:rPr>
           <w:rStyle w:val="Strong"/>
         </w:rPr>
-        <w:t>Apply</w:t>
-      </w:r>
-      <w:r>
-        <w:rPr/>
-        <w:t xml:space="preserve"> in the top bar, or </w:t>
-      </w:r>
-      <w:r>
-        <w:rPr>
-          <w:rStyle w:val="Strong"/>
-        </w:rPr>
-        <w:t>My Leave → Apply for Leave</w:t>
-      </w:r>
-      <w:r>
-        <w:rPr/>
-        <w:t xml:space="preserve">. </w:t>
+        <w:t>Your Next Leave</w:t>
+      </w:r>
+      <w:r>
+        <w:rPr/>
+        <w:t xml:space="preserve"> — your next approved dates and how long until they start. </w:t>
       </w:r>
     </w:p>
     <w:p>
@@ -1166,6 +1164,389 @@
           <w:tab w:val="left" w:pos="709" w:leader="none"/>
         </w:tabs>
         <w:bidi w:val="0"/>
+        <w:ind w:hanging="283" w:left="709"/>
+        <w:jc w:val="left"/>
+        <w:rPr/>
+      </w:pPr>
+      <w:r>
+        <w:rPr>
+          <w:rStyle w:val="Strong"/>
+        </w:rPr>
+        <w:t>Away This Week</w:t>
+      </w:r>
+      <w:r>
+        <w:rPr/>
+        <w:t xml:space="preserve"> — the coming seven working days for your department, with the initials of whoever is off and a count of how many that is out of the team. Amber means the department has reached the number it is allowed to have away at once; red means it has gone past it. </w:t>
+      </w:r>
+    </w:p>
+    <w:p>
+      <w:pPr>
+        <w:pStyle w:val="BodyText"/>
+        <w:bidi w:val="0"/>
+        <w:jc w:val="left"/>
+        <w:rPr/>
+      </w:pPr>
+      <w:r>
+        <w:rPr/>
+        <w:t xml:space="preserve">Managers, HR and executives also get </w:t>
+      </w:r>
+      <w:r>
+        <w:rPr>
+          <w:rStyle w:val="Strong"/>
+        </w:rPr>
+        <w:t>Annual Leave Utilisation</w:t>
+      </w:r>
+      <w:r>
+        <w:rPr/>
+        <w:t>: how much of the year's allocation each of their departments has committed, flagging staff who have booked almost nothing yet — they are the ones who come looking for three weeks in December — and anyone with no allocation at all, who cannot apply until HR runs the annual entitlement.</w:t>
+      </w:r>
+    </w:p>
+    <w:p>
+      <w:pPr>
+        <w:pStyle w:val="Heading3"/>
+        <w:bidi w:val="0"/>
+        <w:jc w:val="left"/>
+        <w:rPr/>
+      </w:pPr>
+      <w:r>
+        <w:rPr/>
+        <w:t>Notifications</w:t>
+      </w:r>
+    </w:p>
+    <w:p>
+      <w:pPr>
+        <w:pStyle w:val="BodyText"/>
+        <w:bidi w:val="0"/>
+        <w:jc w:val="left"/>
+        <w:rPr/>
+      </w:pPr>
+      <w:r>
+        <w:rPr/>
+        <w:t xml:space="preserve">The </w:t>
+      </w:r>
+      <w:r>
+        <w:rPr>
+          <w:rStyle w:val="Strong"/>
+        </w:rPr>
+        <w:t>Alerts</w:t>
+      </w:r>
+      <w:r>
+        <w:rPr/>
+        <w:t xml:space="preserve"> bell in the navigation bar carries a red count of anything you have not read yet. You are notified when:</w:t>
+      </w:r>
+    </w:p>
+    <w:p>
+      <w:pPr>
+        <w:pStyle w:val="BodyText"/>
+        <w:numPr>
+          <w:ilvl w:val="0"/>
+          <w:numId w:val="6"/>
+        </w:numPr>
+        <w:tabs>
+          <w:tab w:val="clear" w:pos="1134"/>
+          <w:tab w:val="left" w:pos="709" w:leader="none"/>
+        </w:tabs>
+        <w:bidi w:val="0"/>
+        <w:spacing w:before="0" w:after="0"/>
+        <w:ind w:hanging="283" w:left="709"/>
+        <w:jc w:val="left"/>
+        <w:rPr/>
+      </w:pPr>
+      <w:r>
+        <w:rPr/>
+        <w:t xml:space="preserve">your request is submitted, so you have confirmation it was received; </w:t>
+      </w:r>
+    </w:p>
+    <w:p>
+      <w:pPr>
+        <w:pStyle w:val="BodyText"/>
+        <w:numPr>
+          <w:ilvl w:val="0"/>
+          <w:numId w:val="6"/>
+        </w:numPr>
+        <w:tabs>
+          <w:tab w:val="clear" w:pos="1134"/>
+          <w:tab w:val="left" w:pos="709" w:leader="none"/>
+        </w:tabs>
+        <w:bidi w:val="0"/>
+        <w:spacing w:before="0" w:after="0"/>
+        <w:ind w:hanging="283" w:left="709"/>
+        <w:jc w:val="left"/>
+        <w:rPr/>
+      </w:pPr>
+      <w:r>
+        <w:rPr/>
+        <w:t xml:space="preserve">it clears a stage, is fully approved, or is declined — with the approver's remarks; </w:t>
+      </w:r>
+    </w:p>
+    <w:p>
+      <w:pPr>
+        <w:pStyle w:val="BodyText"/>
+        <w:numPr>
+          <w:ilvl w:val="0"/>
+          <w:numId w:val="6"/>
+        </w:numPr>
+        <w:tabs>
+          <w:tab w:val="clear" w:pos="1134"/>
+          <w:tab w:val="left" w:pos="709" w:leader="none"/>
+        </w:tabs>
+        <w:bidi w:val="0"/>
+        <w:spacing w:before="0" w:after="0"/>
+        <w:ind w:hanging="283" w:left="709"/>
+        <w:jc w:val="left"/>
+        <w:rPr/>
+      </w:pPr>
+      <w:r>
+        <w:rPr/>
+        <w:t xml:space="preserve">a request needs </w:t>
+      </w:r>
+      <w:r>
+        <w:rPr>
+          <w:rStyle w:val="Emphasis"/>
+        </w:rPr>
+        <w:t>your</w:t>
+      </w:r>
+      <w:r>
+        <w:rPr/>
+        <w:t xml:space="preserve"> approval; </w:t>
+      </w:r>
+    </w:p>
+    <w:p>
+      <w:pPr>
+        <w:pStyle w:val="BodyText"/>
+        <w:numPr>
+          <w:ilvl w:val="0"/>
+          <w:numId w:val="6"/>
+        </w:numPr>
+        <w:tabs>
+          <w:tab w:val="clear" w:pos="1134"/>
+          <w:tab w:val="left" w:pos="709" w:leader="none"/>
+        </w:tabs>
+        <w:bidi w:val="0"/>
+        <w:spacing w:before="0" w:after="0"/>
+        <w:ind w:hanging="283" w:left="709"/>
+        <w:jc w:val="left"/>
+        <w:rPr/>
+      </w:pPr>
+      <w:r>
+        <w:rPr/>
+        <w:t xml:space="preserve">a request in your queue is withdrawn by the person who made it; </w:t>
+      </w:r>
+    </w:p>
+    <w:p>
+      <w:pPr>
+        <w:pStyle w:val="BodyText"/>
+        <w:numPr>
+          <w:ilvl w:val="0"/>
+          <w:numId w:val="6"/>
+        </w:numPr>
+        <w:tabs>
+          <w:tab w:val="clear" w:pos="1134"/>
+          <w:tab w:val="left" w:pos="709" w:leader="none"/>
+        </w:tabs>
+        <w:bidi w:val="0"/>
+        <w:ind w:hanging="283" w:left="709"/>
+        <w:jc w:val="left"/>
+        <w:rPr/>
+      </w:pPr>
+      <w:r>
+        <w:rPr/>
+        <w:t xml:space="preserve">HR or an administrator cancels a request of yours. </w:t>
+      </w:r>
+    </w:p>
+    <w:p>
+      <w:pPr>
+        <w:pStyle w:val="BodyText"/>
+        <w:bidi w:val="0"/>
+        <w:jc w:val="left"/>
+        <w:rPr/>
+      </w:pPr>
+      <w:r>
+        <w:rPr/>
+        <w:t xml:space="preserve">Selecting a notification takes you to the request or queue it refers to and marks it read. </w:t>
+      </w:r>
+      <w:r>
+        <w:rPr>
+          <w:rStyle w:val="Strong"/>
+        </w:rPr>
+        <w:t>View all notifications</w:t>
+      </w:r>
+      <w:r>
+        <w:rPr/>
+        <w:t xml:space="preserve"> lists everything, newest first, with </w:t>
+      </w:r>
+      <w:r>
+        <w:rPr>
+          <w:rStyle w:val="Strong"/>
+        </w:rPr>
+        <w:t>Mark all as read</w:t>
+      </w:r>
+      <w:r>
+        <w:rPr/>
+        <w:t>.</w:t>
+      </w:r>
+    </w:p>
+    <w:tbl>
+      <w:tblPr>
+        <w:tblW w:w="5000" w:type="pct"/>
+        <w:jc w:val="left"/>
+        <w:tblInd w:w="0" w:type="dxa"/>
+        <w:tblLayout w:type="fixed"/>
+        <w:tblCellMar>
+          <w:top w:w="120" w:type="dxa"/>
+          <w:left w:w="120" w:type="dxa"/>
+          <w:bottom w:w="120" w:type="dxa"/>
+          <w:right w:w="120" w:type="dxa"/>
+        </w:tblCellMar>
+      </w:tblPr>
+      <w:tblGrid>
+        <w:gridCol w:w="7193"/>
+      </w:tblGrid>
+      <w:tr>
+        <w:trPr/>
+        <w:tc>
+          <w:tcPr>
+            <w:tcW w:w="7193" w:type="dxa"/>
+            <w:tcBorders/>
+            <w:shd w:fill="F4F7FA" w:val="clear"/>
+            <w:vAlign w:val="center"/>
+          </w:tcPr>
+          <w:p>
+            <w:pPr>
+              <w:pStyle w:val="TableContents"/>
+              <w:bidi w:val="0"/>
+              <w:spacing w:before="0" w:after="160"/>
+              <w:jc w:val="left"/>
+              <w:rPr/>
+            </w:pPr>
+            <w:r>
+              <w:rPr/>
+              <w:t>Notifications are in-app only. The system does not send email, so nothing depends on a mail server being reachable.</w:t>
+            </w:r>
+          </w:p>
+        </w:tc>
+      </w:tr>
+    </w:tbl>
+    <w:p>
+      <w:pPr>
+        <w:pStyle w:val="Heading3"/>
+        <w:bidi w:val="0"/>
+        <w:jc w:val="left"/>
+        <w:rPr/>
+      </w:pPr>
+      <w:r>
+        <w:rPr/>
+        <w:t>The team calendar</w:t>
+      </w:r>
+    </w:p>
+    <w:p>
+      <w:pPr>
+        <w:pStyle w:val="BodyText"/>
+        <w:bidi w:val="0"/>
+        <w:jc w:val="left"/>
+        <w:rPr/>
+      </w:pPr>
+      <w:r>
+        <w:rPr>
+          <w:rStyle w:val="Strong"/>
+        </w:rPr>
+        <w:t>Team Calendar</w:t>
+      </w:r>
+      <w:r>
+        <w:rPr/>
+        <w:t xml:space="preserve"> shows a month at a time for your department: who is off on each working day, and how many that leaves away out of the team. Weekends and public holidays are never counted as absence, and holidays are labelled so an empty day reads as a closure rather than as available cover.</w:t>
+      </w:r>
+    </w:p>
+    <w:p>
+      <w:pPr>
+        <w:pStyle w:val="BodyText"/>
+        <w:bidi w:val="0"/>
+        <w:jc w:val="left"/>
+        <w:rPr/>
+      </w:pPr>
+      <w:r>
+        <w:rPr/>
+        <w:t>Requests still awaiting approval appear in outline and are counted, so a clash is visible before somebody signs it off.</w:t>
+      </w:r>
+    </w:p>
+    <w:p>
+      <w:pPr>
+        <w:pStyle w:val="BodyText"/>
+        <w:bidi w:val="0"/>
+        <w:jc w:val="left"/>
+        <w:rPr/>
+      </w:pPr>
+      <w:r>
+        <w:rPr/>
+        <w:t>What you see depends on your role. Employees see their own department with names only — leave categories are withheld, because sick and maternity leave are nobody else's business. Managers see the departments they are responsible for, in full. HR, executives and administrators can select any department.</w:t>
+      </w:r>
+    </w:p>
+    <w:p>
+      <w:pPr>
+        <w:pStyle w:val="Heading3"/>
+        <w:bidi w:val="0"/>
+        <w:jc w:val="left"/>
+        <w:rPr/>
+      </w:pPr>
+      <w:r>
+        <w:rPr/>
+        <w:t>Applying for leave</w:t>
+      </w:r>
+    </w:p>
+    <w:p>
+      <w:pPr>
+        <w:pStyle w:val="BodyText"/>
+        <w:numPr>
+          <w:ilvl w:val="0"/>
+          <w:numId w:val="7"/>
+        </w:numPr>
+        <w:tabs>
+          <w:tab w:val="clear" w:pos="1134"/>
+          <w:tab w:val="left" w:pos="709" w:leader="none"/>
+        </w:tabs>
+        <w:bidi w:val="0"/>
+        <w:spacing w:before="0" w:after="0"/>
+        <w:ind w:hanging="283" w:left="709"/>
+        <w:jc w:val="left"/>
+        <w:rPr/>
+      </w:pPr>
+      <w:r>
+        <w:rPr/>
+        <w:t xml:space="preserve">Select </w:t>
+      </w:r>
+      <w:r>
+        <w:rPr>
+          <w:rStyle w:val="Strong"/>
+        </w:rPr>
+        <w:t>Apply</w:t>
+      </w:r>
+      <w:r>
+        <w:rPr/>
+        <w:t xml:space="preserve"> in the top bar, or </w:t>
+      </w:r>
+      <w:r>
+        <w:rPr>
+          <w:rStyle w:val="Strong"/>
+        </w:rPr>
+        <w:t>My Leave → Apply for Leave</w:t>
+      </w:r>
+      <w:r>
+        <w:rPr/>
+        <w:t xml:space="preserve">. </w:t>
+      </w:r>
+    </w:p>
+    <w:p>
+      <w:pPr>
+        <w:pStyle w:val="BodyText"/>
+        <w:numPr>
+          <w:ilvl w:val="0"/>
+          <w:numId w:val="7"/>
+        </w:numPr>
+        <w:tabs>
+          <w:tab w:val="clear" w:pos="1134"/>
+          <w:tab w:val="left" w:pos="709" w:leader="none"/>
+        </w:tabs>
+        <w:bidi w:val="0"/>
         <w:spacing w:before="0" w:after="0"/>
         <w:ind w:hanging="283" w:left="709"/>
         <w:jc w:val="left"/>
@@ -1191,7 +1572,7 @@
         <w:pStyle w:val="BodyText"/>
         <w:numPr>
           <w:ilvl w:val="0"/>
-          <w:numId w:val="5"/>
+          <w:numId w:val="7"/>
         </w:numPr>
         <w:tabs>
           <w:tab w:val="clear" w:pos="1134"/>
@@ -1233,7 +1614,7 @@
         <w:pStyle w:val="BodyText"/>
         <w:numPr>
           <w:ilvl w:val="0"/>
-          <w:numId w:val="5"/>
+          <w:numId w:val="7"/>
         </w:numPr>
         <w:tabs>
           <w:tab w:val="clear" w:pos="1134"/>
@@ -1265,7 +1646,7 @@
         <w:pStyle w:val="BodyText"/>
         <w:numPr>
           <w:ilvl w:val="0"/>
-          <w:numId w:val="5"/>
+          <w:numId w:val="7"/>
         </w:numPr>
         <w:tabs>
           <w:tab w:val="clear" w:pos="1134"/>
@@ -1297,7 +1678,7 @@
         <w:pStyle w:val="BodyText"/>
         <w:numPr>
           <w:ilvl w:val="0"/>
-          <w:numId w:val="5"/>
+          <w:numId w:val="7"/>
         </w:numPr>
         <w:tabs>
           <w:tab w:val="clear" w:pos="1134"/>
@@ -2659,7 +3040,7 @@
         <w:pStyle w:val="BodyText"/>
         <w:numPr>
           <w:ilvl w:val="0"/>
-          <w:numId w:val="6"/>
+          <w:numId w:val="8"/>
         </w:numPr>
         <w:tabs>
           <w:tab w:val="clear" w:pos="1134"/>
@@ -2681,7 +3062,7 @@
         <w:pStyle w:val="BodyText"/>
         <w:numPr>
           <w:ilvl w:val="0"/>
-          <w:numId w:val="6"/>
+          <w:numId w:val="8"/>
         </w:numPr>
         <w:tabs>
           <w:tab w:val="clear" w:pos="1134"/>
@@ -2703,7 +3084,7 @@
         <w:pStyle w:val="BodyText"/>
         <w:numPr>
           <w:ilvl w:val="0"/>
-          <w:numId w:val="6"/>
+          <w:numId w:val="8"/>
         </w:numPr>
         <w:tabs>
           <w:tab w:val="clear" w:pos="1134"/>
@@ -2725,7 +3106,7 @@
         <w:pStyle w:val="BodyText"/>
         <w:numPr>
           <w:ilvl w:val="0"/>
-          <w:numId w:val="6"/>
+          <w:numId w:val="8"/>
         </w:numPr>
         <w:tabs>
           <w:tab w:val="clear" w:pos="1134"/>
@@ -2747,7 +3128,7 @@
         <w:pStyle w:val="BodyText"/>
         <w:numPr>
           <w:ilvl w:val="0"/>
-          <w:numId w:val="6"/>
+          <w:numId w:val="8"/>
         </w:numPr>
         <w:tabs>
           <w:tab w:val="clear" w:pos="1134"/>
@@ -2769,7 +3150,7 @@
         <w:pStyle w:val="BodyText"/>
         <w:numPr>
           <w:ilvl w:val="0"/>
-          <w:numId w:val="6"/>
+          <w:numId w:val="8"/>
         </w:numPr>
         <w:tabs>
           <w:tab w:val="clear" w:pos="1134"/>
@@ -2804,7 +3185,7 @@
         <w:pStyle w:val="BodyText"/>
         <w:numPr>
           <w:ilvl w:val="0"/>
-          <w:numId w:val="7"/>
+          <w:numId w:val="9"/>
         </w:numPr>
         <w:tabs>
           <w:tab w:val="clear" w:pos="1134"/>
@@ -2826,7 +3207,7 @@
         <w:pStyle w:val="BodyText"/>
         <w:numPr>
           <w:ilvl w:val="0"/>
-          <w:numId w:val="7"/>
+          <w:numId w:val="9"/>
         </w:numPr>
         <w:tabs>
           <w:tab w:val="clear" w:pos="1134"/>
@@ -2848,7 +3229,7 @@
         <w:pStyle w:val="BodyText"/>
         <w:numPr>
           <w:ilvl w:val="0"/>
-          <w:numId w:val="7"/>
+          <w:numId w:val="9"/>
         </w:numPr>
         <w:tabs>
           <w:tab w:val="clear" w:pos="1134"/>
@@ -2870,7 +3251,7 @@
         <w:pStyle w:val="BodyText"/>
         <w:numPr>
           <w:ilvl w:val="0"/>
-          <w:numId w:val="7"/>
+          <w:numId w:val="9"/>
         </w:numPr>
         <w:tabs>
           <w:tab w:val="clear" w:pos="1134"/>
@@ -2985,7 +3366,7 @@
         <w:pStyle w:val="BodyText"/>
         <w:numPr>
           <w:ilvl w:val="0"/>
-          <w:numId w:val="8"/>
+          <w:numId w:val="10"/>
         </w:numPr>
         <w:tabs>
           <w:tab w:val="clear" w:pos="1134"/>
@@ -3017,7 +3398,7 @@
         <w:pStyle w:val="BodyText"/>
         <w:numPr>
           <w:ilvl w:val="0"/>
-          <w:numId w:val="8"/>
+          <w:numId w:val="10"/>
         </w:numPr>
         <w:tabs>
           <w:tab w:val="clear" w:pos="1134"/>
@@ -3049,7 +3430,7 @@
         <w:pStyle w:val="BodyText"/>
         <w:numPr>
           <w:ilvl w:val="0"/>
-          <w:numId w:val="8"/>
+          <w:numId w:val="10"/>
         </w:numPr>
         <w:tabs>
           <w:tab w:val="clear" w:pos="1134"/>
@@ -3081,7 +3462,7 @@
         <w:pStyle w:val="BodyText"/>
         <w:numPr>
           <w:ilvl w:val="0"/>
-          <w:numId w:val="8"/>
+          <w:numId w:val="10"/>
         </w:numPr>
         <w:tabs>
           <w:tab w:val="clear" w:pos="1134"/>
@@ -3103,7 +3484,7 @@
         <w:pStyle w:val="BodyText"/>
         <w:numPr>
           <w:ilvl w:val="0"/>
-          <w:numId w:val="8"/>
+          <w:numId w:val="10"/>
         </w:numPr>
         <w:tabs>
           <w:tab w:val="clear" w:pos="1134"/>
@@ -3148,6 +3529,373 @@
       </w:pPr>
       <w:r>
         <w:rPr/>
+        <w:t>Protecting your cover</w:t>
+      </w:r>
+    </w:p>
+    <w:p>
+      <w:pPr>
+        <w:pStyle w:val="BodyText"/>
+        <w:bidi w:val="0"/>
+        <w:jc w:val="left"/>
+        <w:rPr/>
+      </w:pPr>
+      <w:r>
+        <w:rPr/>
+        <w:t>Each department can be given a limit on how many people may be away on the same working day. Administrators set it; you see the consequences.</w:t>
+      </w:r>
+    </w:p>
+    <w:p>
+      <w:pPr>
+        <w:pStyle w:val="BodyText"/>
+        <w:bidi w:val="0"/>
+        <w:jc w:val="left"/>
+        <w:rPr/>
+      </w:pPr>
+      <w:r>
+        <w:rPr/>
+        <w:t>When you open a request for review, the screen tells you what approving it would do to your cover:</w:t>
+      </w:r>
+    </w:p>
+    <w:tbl>
+      <w:tblPr>
+        <w:tblW w:w="7193" w:type="dxa"/>
+        <w:jc w:val="left"/>
+        <w:tblInd w:w="-7" w:type="dxa"/>
+        <w:tblLayout w:type="fixed"/>
+        <w:tblCellMar>
+          <w:top w:w="75" w:type="dxa"/>
+          <w:left w:w="75" w:type="dxa"/>
+          <w:bottom w:w="75" w:type="dxa"/>
+          <w:right w:w="75" w:type="dxa"/>
+        </w:tblCellMar>
+      </w:tblPr>
+      <w:tblGrid>
+        <w:gridCol w:w="2451"/>
+        <w:gridCol w:w="4742"/>
+      </w:tblGrid>
+      <w:tr>
+        <w:trPr>
+          <w:tblHeader w:val="true"/>
+        </w:trPr>
+        <w:tc>
+          <w:tcPr>
+            <w:tcW w:w="2451" w:type="dxa"/>
+            <w:tcBorders>
+              <w:top w:val="single" w:sz="6" w:space="0" w:color="808080"/>
+              <w:left w:val="single" w:sz="6" w:space="0" w:color="808080"/>
+              <w:bottom w:val="single" w:sz="2" w:space="0" w:color="808080"/>
+              <w:right w:val="single" w:sz="6" w:space="0" w:color="808080"/>
+            </w:tcBorders>
+            <w:vAlign w:val="center"/>
+          </w:tcPr>
+          <w:p>
+            <w:pPr>
+              <w:pStyle w:val="TableHeading"/>
+              <w:bidi w:val="0"/>
+              <w:spacing w:before="0" w:after="160"/>
+              <w:jc w:val="left"/>
+              <w:rPr/>
+            </w:pPr>
+            <w:r>
+              <w:rPr/>
+              <w:t>Notice</w:t>
+            </w:r>
+          </w:p>
+        </w:tc>
+        <w:tc>
+          <w:tcPr>
+            <w:tcW w:w="4742" w:type="dxa"/>
+            <w:tcBorders>
+              <w:top w:val="single" w:sz="6" w:space="0" w:color="808080"/>
+              <w:left w:val="single" w:sz="2" w:space="0" w:color="808080"/>
+              <w:bottom w:val="single" w:sz="2" w:space="0" w:color="808080"/>
+              <w:right w:val="single" w:sz="6" w:space="0" w:color="808080"/>
+            </w:tcBorders>
+            <w:vAlign w:val="center"/>
+          </w:tcPr>
+          <w:p>
+            <w:pPr>
+              <w:pStyle w:val="TableHeading"/>
+              <w:bidi w:val="0"/>
+              <w:spacing w:before="0" w:after="160"/>
+              <w:jc w:val="left"/>
+              <w:rPr/>
+            </w:pPr>
+            <w:r>
+              <w:rPr/>
+              <w:t>Meaning</w:t>
+            </w:r>
+          </w:p>
+        </w:tc>
+      </w:tr>
+      <w:tr>
+        <w:trPr/>
+        <w:tc>
+          <w:tcPr>
+            <w:tcW w:w="2451" w:type="dxa"/>
+            <w:tcBorders>
+              <w:left w:val="single" w:sz="6" w:space="0" w:color="808080"/>
+              <w:bottom w:val="single" w:sz="2" w:space="0" w:color="808080"/>
+              <w:right w:val="single" w:sz="6" w:space="0" w:color="808080"/>
+            </w:tcBorders>
+            <w:vAlign w:val="center"/>
+          </w:tcPr>
+          <w:p>
+            <w:pPr>
+              <w:pStyle w:val="TableContents"/>
+              <w:bidi w:val="0"/>
+              <w:spacing w:before="0" w:after="160"/>
+              <w:jc w:val="left"/>
+              <w:rPr/>
+            </w:pPr>
+            <w:r>
+              <w:rPr/>
+              <w:t>Green</w:t>
+            </w:r>
+          </w:p>
+        </w:tc>
+        <w:tc>
+          <w:tcPr>
+            <w:tcW w:w="4742" w:type="dxa"/>
+            <w:tcBorders>
+              <w:left w:val="single" w:sz="2" w:space="0" w:color="808080"/>
+              <w:bottom w:val="single" w:sz="2" w:space="0" w:color="808080"/>
+              <w:right w:val="single" w:sz="6" w:space="0" w:color="808080"/>
+            </w:tcBorders>
+            <w:vAlign w:val="center"/>
+          </w:tcPr>
+          <w:p>
+            <w:pPr>
+              <w:pStyle w:val="TableContents"/>
+              <w:bidi w:val="0"/>
+              <w:spacing w:before="0" w:after="160"/>
+              <w:jc w:val="left"/>
+              <w:rPr/>
+            </w:pPr>
+            <w:r>
+              <w:rPr/>
+              <w:t>The department stays within its limit. Nothing to weigh up.</w:t>
+            </w:r>
+          </w:p>
+        </w:tc>
+      </w:tr>
+      <w:tr>
+        <w:trPr/>
+        <w:tc>
+          <w:tcPr>
+            <w:tcW w:w="2451" w:type="dxa"/>
+            <w:tcBorders>
+              <w:left w:val="single" w:sz="6" w:space="0" w:color="808080"/>
+              <w:bottom w:val="single" w:sz="2" w:space="0" w:color="808080"/>
+              <w:right w:val="single" w:sz="6" w:space="0" w:color="808080"/>
+            </w:tcBorders>
+            <w:vAlign w:val="center"/>
+          </w:tcPr>
+          <w:p>
+            <w:pPr>
+              <w:pStyle w:val="TableContents"/>
+              <w:bidi w:val="0"/>
+              <w:spacing w:before="0" w:after="160"/>
+              <w:jc w:val="left"/>
+              <w:rPr/>
+            </w:pPr>
+            <w:r>
+              <w:rPr/>
+              <w:t xml:space="preserve">Amber — </w:t>
+            </w:r>
+            <w:r>
+              <w:rPr>
+                <w:rStyle w:val="Emphasis"/>
+              </w:rPr>
+              <w:t>takes the department to its limit</w:t>
+            </w:r>
+          </w:p>
+        </w:tc>
+        <w:tc>
+          <w:tcPr>
+            <w:tcW w:w="4742" w:type="dxa"/>
+            <w:tcBorders>
+              <w:left w:val="single" w:sz="2" w:space="0" w:color="808080"/>
+              <w:bottom w:val="single" w:sz="2" w:space="0" w:color="808080"/>
+              <w:right w:val="single" w:sz="6" w:space="0" w:color="808080"/>
+            </w:tcBorders>
+            <w:vAlign w:val="center"/>
+          </w:tcPr>
+          <w:p>
+            <w:pPr>
+              <w:pStyle w:val="TableContents"/>
+              <w:bidi w:val="0"/>
+              <w:spacing w:before="0" w:after="160"/>
+              <w:jc w:val="left"/>
+              <w:rPr/>
+            </w:pPr>
+            <w:r>
+              <w:rPr/>
+              <w:t>Allowed, but it uses the last slot. No cover left if somebody falls ill.</w:t>
+            </w:r>
+          </w:p>
+        </w:tc>
+      </w:tr>
+      <w:tr>
+        <w:trPr/>
+        <w:tc>
+          <w:tcPr>
+            <w:tcW w:w="2451" w:type="dxa"/>
+            <w:tcBorders>
+              <w:left w:val="single" w:sz="6" w:space="0" w:color="808080"/>
+              <w:bottom w:val="single" w:sz="2" w:space="0" w:color="808080"/>
+              <w:right w:val="single" w:sz="6" w:space="0" w:color="808080"/>
+            </w:tcBorders>
+            <w:vAlign w:val="center"/>
+          </w:tcPr>
+          <w:p>
+            <w:pPr>
+              <w:pStyle w:val="TableContents"/>
+              <w:bidi w:val="0"/>
+              <w:spacing w:before="0" w:after="160"/>
+              <w:jc w:val="left"/>
+              <w:rPr/>
+            </w:pPr>
+            <w:r>
+              <w:rPr/>
+              <w:t xml:space="preserve">Amber — </w:t>
+            </w:r>
+            <w:r>
+              <w:rPr>
+                <w:rStyle w:val="Emphasis"/>
+              </w:rPr>
+              <w:t>already over its limit</w:t>
+            </w:r>
+          </w:p>
+        </w:tc>
+        <w:tc>
+          <w:tcPr>
+            <w:tcW w:w="4742" w:type="dxa"/>
+            <w:tcBorders>
+              <w:left w:val="single" w:sz="2" w:space="0" w:color="808080"/>
+              <w:bottom w:val="single" w:sz="2" w:space="0" w:color="808080"/>
+              <w:right w:val="single" w:sz="6" w:space="0" w:color="808080"/>
+            </w:tcBorders>
+            <w:vAlign w:val="center"/>
+          </w:tcPr>
+          <w:p>
+            <w:pPr>
+              <w:pStyle w:val="TableContents"/>
+              <w:bidi w:val="0"/>
+              <w:spacing w:before="0" w:after="160"/>
+              <w:jc w:val="left"/>
+              <w:rPr/>
+            </w:pPr>
+            <w:r>
+              <w:rPr/>
+              <w:t>The department is short on those days whether or not you approve this one. Worth raising separately.</w:t>
+            </w:r>
+          </w:p>
+        </w:tc>
+      </w:tr>
+      <w:tr>
+        <w:trPr/>
+        <w:tc>
+          <w:tcPr>
+            <w:tcW w:w="2451" w:type="dxa"/>
+            <w:tcBorders>
+              <w:left w:val="single" w:sz="6" w:space="0" w:color="808080"/>
+              <w:bottom w:val="single" w:sz="6" w:space="0" w:color="808080"/>
+              <w:right w:val="single" w:sz="6" w:space="0" w:color="808080"/>
+            </w:tcBorders>
+            <w:vAlign w:val="center"/>
+          </w:tcPr>
+          <w:p>
+            <w:pPr>
+              <w:pStyle w:val="TableContents"/>
+              <w:bidi w:val="0"/>
+              <w:spacing w:before="0" w:after="160"/>
+              <w:jc w:val="left"/>
+              <w:rPr/>
+            </w:pPr>
+            <w:r>
+              <w:rPr/>
+              <w:t xml:space="preserve">Red — </w:t>
+            </w:r>
+            <w:r>
+              <w:rPr>
+                <w:rStyle w:val="Emphasis"/>
+              </w:rPr>
+              <w:t>leaves the department short</w:t>
+            </w:r>
+          </w:p>
+        </w:tc>
+        <w:tc>
+          <w:tcPr>
+            <w:tcW w:w="4742" w:type="dxa"/>
+            <w:tcBorders>
+              <w:left w:val="single" w:sz="2" w:space="0" w:color="808080"/>
+              <w:bottom w:val="single" w:sz="6" w:space="0" w:color="808080"/>
+              <w:right w:val="single" w:sz="6" w:space="0" w:color="808080"/>
+            </w:tcBorders>
+            <w:vAlign w:val="center"/>
+          </w:tcPr>
+          <w:p>
+            <w:pPr>
+              <w:pStyle w:val="TableContents"/>
+              <w:bidi w:val="0"/>
+              <w:spacing w:before="0" w:after="160"/>
+              <w:jc w:val="left"/>
+              <w:rPr/>
+            </w:pPr>
+            <w:r>
+              <w:rPr>
+                <w:rStyle w:val="Strong"/>
+              </w:rPr>
+              <w:t>This request</w:t>
+            </w:r>
+            <w:r>
+              <w:rPr/>
+              <w:t xml:space="preserve"> is what pushes the department past its limit, on the days listed.</w:t>
+            </w:r>
+          </w:p>
+        </w:tc>
+      </w:tr>
+    </w:tbl>
+    <w:p>
+      <w:pPr>
+        <w:pStyle w:val="BodyText"/>
+        <w:bidi w:val="0"/>
+        <w:jc w:val="left"/>
+        <w:rPr/>
+      </w:pPr>
+      <w:r>
+        <w:rPr/>
+        <w:t>The queue itself flags the affected rows, so you can see which requests need a closer look without opening each one, and every notice links straight to the month on the team calendar.</w:t>
+      </w:r>
+    </w:p>
+    <w:p>
+      <w:pPr>
+        <w:pStyle w:val="BodyText"/>
+        <w:bidi w:val="0"/>
+        <w:jc w:val="left"/>
+        <w:rPr/>
+      </w:pPr>
+      <w:r>
+        <w:rPr>
+          <w:rStyle w:val="Strong"/>
+        </w:rPr>
+        <w:t>Nothing is blocked.</w:t>
+      </w:r>
+      <w:r>
+        <w:rPr/>
+        <w:t xml:space="preserve"> Sick leave does not wait for a rota to be convenient, and the notice does not stop you approving anything — it makes sure you know what you are agreeing to. If a department has no limit configured, no notice appears.</w:t>
+      </w:r>
+    </w:p>
+    <w:p>
+      <w:pPr>
+        <w:pStyle w:val="Heading3"/>
+        <w:bidi w:val="0"/>
+        <w:jc w:val="left"/>
+        <w:rPr/>
+      </w:pPr>
+      <w:r>
+        <w:rPr/>
         <w:t>Whose leave you see</w:t>
       </w:r>
     </w:p>
@@ -3180,7 +3928,7 @@
       </w:r>
       <w:r>
         <w:rPr/>
-        <w:t xml:space="preserve"> of their department. You will never see another manager's team.</w:t>
+        <w:t xml:space="preserve"> of their department. You will never see another manager's team. The team calendar follows the same boundary, so you can see cover for every department you approve for — including a second department if you head more than one.</w:t>
       </w:r>
     </w:p>
     <w:tbl>
@@ -3352,7 +4100,7 @@
         <w:pStyle w:val="BodyText"/>
         <w:numPr>
           <w:ilvl w:val="0"/>
-          <w:numId w:val="9"/>
+          <w:numId w:val="11"/>
         </w:numPr>
         <w:tabs>
           <w:tab w:val="clear" w:pos="1134"/>
@@ -3380,7 +4128,7 @@
         <w:pStyle w:val="BodyText"/>
         <w:numPr>
           <w:ilvl w:val="0"/>
-          <w:numId w:val="9"/>
+          <w:numId w:val="11"/>
         </w:numPr>
         <w:tabs>
           <w:tab w:val="clear" w:pos="1134"/>
@@ -3601,7 +4349,7 @@
         <w:pStyle w:val="BodyText"/>
         <w:numPr>
           <w:ilvl w:val="0"/>
-          <w:numId w:val="10"/>
+          <w:numId w:val="12"/>
         </w:numPr>
         <w:tabs>
           <w:tab w:val="clear" w:pos="1134"/>
@@ -3639,7 +4387,7 @@
         <w:pStyle w:val="BodyText"/>
         <w:numPr>
           <w:ilvl w:val="0"/>
-          <w:numId w:val="10"/>
+          <w:numId w:val="12"/>
         </w:numPr>
         <w:tabs>
           <w:tab w:val="clear" w:pos="1134"/>
@@ -4217,7 +4965,7 @@
         <w:pStyle w:val="BodyText"/>
         <w:numPr>
           <w:ilvl w:val="0"/>
-          <w:numId w:val="11"/>
+          <w:numId w:val="13"/>
         </w:numPr>
         <w:tabs>
           <w:tab w:val="clear" w:pos="1134"/>
@@ -4245,7 +4993,7 @@
         <w:pStyle w:val="BodyText"/>
         <w:numPr>
           <w:ilvl w:val="0"/>
-          <w:numId w:val="11"/>
+          <w:numId w:val="13"/>
         </w:numPr>
         <w:tabs>
           <w:tab w:val="clear" w:pos="1134"/>
@@ -4267,7 +5015,7 @@
         <w:pStyle w:val="BodyText"/>
         <w:numPr>
           <w:ilvl w:val="0"/>
-          <w:numId w:val="11"/>
+          <w:numId w:val="13"/>
         </w:numPr>
         <w:tabs>
           <w:tab w:val="clear" w:pos="1134"/>
@@ -4319,7 +5067,7 @@
         <w:pStyle w:val="BodyText"/>
         <w:numPr>
           <w:ilvl w:val="0"/>
-          <w:numId w:val="11"/>
+          <w:numId w:val="13"/>
         </w:numPr>
         <w:tabs>
           <w:tab w:val="clear" w:pos="1134"/>
@@ -4341,7 +5089,7 @@
         <w:pStyle w:val="BodyText"/>
         <w:numPr>
           <w:ilvl w:val="0"/>
-          <w:numId w:val="11"/>
+          <w:numId w:val="13"/>
         </w:numPr>
         <w:tabs>
           <w:tab w:val="clear" w:pos="1134"/>
@@ -4396,7 +5144,7 @@
         <w:pStyle w:val="BodyText"/>
         <w:numPr>
           <w:ilvl w:val="0"/>
-          <w:numId w:val="12"/>
+          <w:numId w:val="14"/>
         </w:numPr>
         <w:tabs>
           <w:tab w:val="clear" w:pos="1134"/>
@@ -4428,7 +5176,7 @@
         <w:pStyle w:val="BodyText"/>
         <w:numPr>
           <w:ilvl w:val="0"/>
-          <w:numId w:val="12"/>
+          <w:numId w:val="14"/>
         </w:numPr>
         <w:tabs>
           <w:tab w:val="clear" w:pos="1134"/>
@@ -5130,6 +5878,127 @@
       <w:r>
         <w:rPr/>
         <w:t xml:space="preserve"> calculations; leave that has already been submitted keeps the day count it was approved with.</w:t>
+      </w:r>
+    </w:p>
+    <w:p>
+      <w:pPr>
+        <w:pStyle w:val="BodyText"/>
+        <w:bidi w:val="0"/>
+        <w:jc w:val="left"/>
+        <w:rPr/>
+      </w:pPr>
+      <w:r>
+        <w:rPr>
+          <w:rStyle w:val="Strong"/>
+        </w:rPr>
+        <w:t>Maximum Away At Once</w:t>
+      </w:r>
+      <w:r>
+        <w:rPr/>
+        <w:t xml:space="preserve"> sets how many of a department's members may be on leave on the same working day. It drives the shading on the team calendar and the coverage notice approvers see before they sign off.</w:t>
+      </w:r>
+    </w:p>
+    <w:p>
+      <w:pPr>
+        <w:pStyle w:val="BodyText"/>
+        <w:numPr>
+          <w:ilvl w:val="0"/>
+          <w:numId w:val="15"/>
+        </w:numPr>
+        <w:tabs>
+          <w:tab w:val="clear" w:pos="1134"/>
+          <w:tab w:val="left" w:pos="709" w:leader="none"/>
+        </w:tabs>
+        <w:bidi w:val="0"/>
+        <w:spacing w:before="0" w:after="0"/>
+        <w:ind w:hanging="283" w:left="709"/>
+        <w:jc w:val="left"/>
+        <w:rPr/>
+      </w:pPr>
+      <w:r>
+        <w:rPr/>
+        <w:t xml:space="preserve">Leave it </w:t>
+      </w:r>
+      <w:r>
+        <w:rPr>
+          <w:rStyle w:val="Strong"/>
+        </w:rPr>
+        <w:t>blank</w:t>
+      </w:r>
+      <w:r>
+        <w:rPr/>
+        <w:t xml:space="preserve"> for no limit. Nothing is shaded and no notice appears. </w:t>
+      </w:r>
+    </w:p>
+    <w:p>
+      <w:pPr>
+        <w:pStyle w:val="BodyText"/>
+        <w:numPr>
+          <w:ilvl w:val="0"/>
+          <w:numId w:val="15"/>
+        </w:numPr>
+        <w:tabs>
+          <w:tab w:val="clear" w:pos="1134"/>
+          <w:tab w:val="left" w:pos="709" w:leader="none"/>
+        </w:tabs>
+        <w:bidi w:val="0"/>
+        <w:spacing w:before="0" w:after="0"/>
+        <w:ind w:hanging="283" w:left="709"/>
+        <w:jc w:val="left"/>
+        <w:rPr/>
+      </w:pPr>
+      <w:r>
+        <w:rPr>
+          <w:rStyle w:val="Strong"/>
+        </w:rPr>
+        <w:t>Zero</w:t>
+      </w:r>
+      <w:r>
+        <w:rPr/>
+        <w:t xml:space="preserve"> means nobody may be away at all — accepted, if that is genuinely what the department needs. </w:t>
+      </w:r>
+    </w:p>
+    <w:p>
+      <w:pPr>
+        <w:pStyle w:val="BodyText"/>
+        <w:numPr>
+          <w:ilvl w:val="0"/>
+          <w:numId w:val="15"/>
+        </w:numPr>
+        <w:tabs>
+          <w:tab w:val="clear" w:pos="1134"/>
+          <w:tab w:val="left" w:pos="709" w:leader="none"/>
+        </w:tabs>
+        <w:bidi w:val="0"/>
+        <w:ind w:hanging="283" w:left="709"/>
+        <w:jc w:val="left"/>
+        <w:rPr/>
+      </w:pPr>
+      <w:r>
+        <w:rPr/>
+        <w:t xml:space="preserve">A limit that is </w:t>
+      </w:r>
+      <w:r>
+        <w:rPr>
+          <w:rStyle w:val="Strong"/>
+        </w:rPr>
+        <w:t>at or above the department's headcount</w:t>
+      </w:r>
+      <w:r>
+        <w:rPr/>
+        <w:t xml:space="preserve"> can never be exceeded; the listing points this out, so you are not left wondering why no warning ever appears. </w:t>
+      </w:r>
+    </w:p>
+    <w:p>
+      <w:pPr>
+        <w:pStyle w:val="BodyText"/>
+        <w:bidi w:val="0"/>
+        <w:jc w:val="left"/>
+        <w:rPr/>
+      </w:pPr>
+      <w:r>
+        <w:rPr/>
+        <w:t>Set it below the headcount by the number of people the team can actually spare. A team of six that needs four on the floor has a limit of two.</w:t>
       </w:r>
     </w:p>
     <w:tbl>
@@ -8991,8 +9860,8 @@
   <w:abstractNum w:abstractNumId="5">
     <w:lvl w:ilvl="0">
       <w:start w:val="1"/>
-      <w:numFmt w:val="decimal"/>
-      <w:lvlText w:val="%1."/>
+      <w:numFmt w:val="bullet"/>
+      <w:lvlText w:val=""/>
       <w:lvlJc w:val="left"/>
       <w:pPr>
         <w:tabs>
@@ -9000,12 +9869,14 @@
         </w:tabs>
         <w:ind w:left="709" w:hanging="283"/>
       </w:pPr>
-      <w:rPr/>
+      <w:rPr>
+        <w:rFonts w:ascii="Symbol" w:hAnsi="Symbol" w:cs="Symbol" w:hint="default"/>
+      </w:rPr>
     </w:lvl>
     <w:lvl w:ilvl="1">
       <w:start w:val="1"/>
-      <w:numFmt w:val="decimal"/>
-      <w:lvlText w:val="%2."/>
+      <w:numFmt w:val="bullet"/>
+      <w:lvlText w:val=""/>
       <w:lvlJc w:val="left"/>
       <w:pPr>
         <w:tabs>
@@ -9013,12 +9884,14 @@
         </w:tabs>
         <w:ind w:left="1418" w:hanging="283"/>
       </w:pPr>
-      <w:rPr/>
+      <w:rPr>
+        <w:rFonts w:ascii="Symbol" w:hAnsi="Symbol" w:cs="Symbol" w:hint="default"/>
+      </w:rPr>
     </w:lvl>
     <w:lvl w:ilvl="2">
       <w:start w:val="1"/>
-      <w:numFmt w:val="decimal"/>
-      <w:lvlText w:val="%3."/>
+      <w:numFmt w:val="bullet"/>
+      <w:lvlText w:val=""/>
       <w:lvlJc w:val="left"/>
       <w:pPr>
         <w:tabs>
@@ -9026,12 +9899,14 @@
         </w:tabs>
         <w:ind w:left="2127" w:hanging="283"/>
       </w:pPr>
-      <w:rPr/>
+      <w:rPr>
+        <w:rFonts w:ascii="Symbol" w:hAnsi="Symbol" w:cs="Symbol" w:hint="default"/>
+      </w:rPr>
     </w:lvl>
     <w:lvl w:ilvl="3">
       <w:start w:val="1"/>
-      <w:numFmt w:val="decimal"/>
-      <w:lvlText w:val="%4."/>
+      <w:numFmt w:val="bullet"/>
+      <w:lvlText w:val=""/>
       <w:lvlJc w:val="left"/>
       <w:pPr>
         <w:tabs>
@@ -9039,12 +9914,14 @@
         </w:tabs>
         <w:ind w:left="2836" w:hanging="283"/>
       </w:pPr>
-      <w:rPr/>
+      <w:rPr>
+        <w:rFonts w:ascii="Symbol" w:hAnsi="Symbol" w:cs="Symbol" w:hint="default"/>
+      </w:rPr>
     </w:lvl>
     <w:lvl w:ilvl="4">
       <w:start w:val="1"/>
-      <w:numFmt w:val="decimal"/>
-      <w:lvlText w:val="%5."/>
+      <w:numFmt w:val="bullet"/>
+      <w:lvlText w:val=""/>
       <w:lvlJc w:val="left"/>
       <w:pPr>
         <w:tabs>
@@ -9052,12 +9929,14 @@
         </w:tabs>
         <w:ind w:left="3545" w:hanging="283"/>
       </w:pPr>
-      <w:rPr/>
+      <w:rPr>
+        <w:rFonts w:ascii="Symbol" w:hAnsi="Symbol" w:cs="Symbol" w:hint="default"/>
+      </w:rPr>
     </w:lvl>
     <w:lvl w:ilvl="5">
       <w:start w:val="1"/>
-      <w:numFmt w:val="decimal"/>
-      <w:lvlText w:val="%6."/>
+      <w:numFmt w:val="bullet"/>
+      <w:lvlText w:val=""/>
       <w:lvlJc w:val="left"/>
       <w:pPr>
         <w:tabs>
@@ -9065,12 +9944,14 @@
         </w:tabs>
         <w:ind w:left="4254" w:hanging="283"/>
       </w:pPr>
-      <w:rPr/>
+      <w:rPr>
+        <w:rFonts w:ascii="Symbol" w:hAnsi="Symbol" w:cs="Symbol" w:hint="default"/>
+      </w:rPr>
     </w:lvl>
     <w:lvl w:ilvl="6">
       <w:start w:val="1"/>
-      <w:numFmt w:val="decimal"/>
-      <w:lvlText w:val="%7."/>
+      <w:numFmt w:val="bullet"/>
+      <w:lvlText w:val=""/>
       <w:lvlJc w:val="left"/>
       <w:pPr>
         <w:tabs>
@@ -9078,12 +9959,14 @@
         </w:tabs>
         <w:ind w:left="4963" w:hanging="283"/>
       </w:pPr>
-      <w:rPr/>
+      <w:rPr>
+        <w:rFonts w:ascii="Symbol" w:hAnsi="Symbol" w:cs="Symbol" w:hint="default"/>
+      </w:rPr>
     </w:lvl>
     <w:lvl w:ilvl="7">
       <w:start w:val="1"/>
-      <w:numFmt w:val="decimal"/>
-      <w:lvlText w:val="%8."/>
+      <w:numFmt w:val="bullet"/>
+      <w:lvlText w:val=""/>
       <w:lvlJc w:val="left"/>
       <w:pPr>
         <w:tabs>
@@ -9091,12 +9974,14 @@
         </w:tabs>
         <w:ind w:left="5672" w:hanging="283"/>
       </w:pPr>
-      <w:rPr/>
+      <w:rPr>
+        <w:rFonts w:ascii="Symbol" w:hAnsi="Symbol" w:cs="Symbol" w:hint="default"/>
+      </w:rPr>
     </w:lvl>
     <w:lvl w:ilvl="8">
       <w:start w:val="1"/>
-      <w:numFmt w:val="decimal"/>
-      <w:lvlText w:val="%9."/>
+      <w:numFmt w:val="bullet"/>
+      <w:lvlText w:val=""/>
       <w:lvlJc w:val="left"/>
       <w:pPr>
         <w:tabs>
@@ -9104,7 +9989,9 @@
         </w:tabs>
         <w:ind w:left="6381" w:hanging="283"/>
       </w:pPr>
-      <w:rPr/>
+      <w:rPr>
+        <w:rFonts w:ascii="Symbol" w:hAnsi="Symbol" w:cs="Symbol" w:hint="default"/>
+      </w:rPr>
     </w:lvl>
   </w:abstractNum>
   <w:abstractNum w:abstractNumId="6">
@@ -9247,6 +10134,125 @@
   <w:abstractNum w:abstractNumId="7">
     <w:lvl w:ilvl="0">
       <w:start w:val="1"/>
+      <w:numFmt w:val="decimal"/>
+      <w:lvlText w:val="%1."/>
+      <w:lvlJc w:val="left"/>
+      <w:pPr>
+        <w:tabs>
+          <w:tab w:val="num" w:pos="709"/>
+        </w:tabs>
+        <w:ind w:left="709" w:hanging="283"/>
+      </w:pPr>
+      <w:rPr/>
+    </w:lvl>
+    <w:lvl w:ilvl="1">
+      <w:start w:val="1"/>
+      <w:numFmt w:val="decimal"/>
+      <w:lvlText w:val="%2."/>
+      <w:lvlJc w:val="left"/>
+      <w:pPr>
+        <w:tabs>
+          <w:tab w:val="num" w:pos="1418"/>
+        </w:tabs>
+        <w:ind w:left="1418" w:hanging="283"/>
+      </w:pPr>
+      <w:rPr/>
+    </w:lvl>
+    <w:lvl w:ilvl="2">
+      <w:start w:val="1"/>
+      <w:numFmt w:val="decimal"/>
+      <w:lvlText w:val="%3."/>
+      <w:lvlJc w:val="left"/>
+      <w:pPr>
+        <w:tabs>
+          <w:tab w:val="num" w:pos="2127"/>
+        </w:tabs>
+        <w:ind w:left="2127" w:hanging="283"/>
+      </w:pPr>
+      <w:rPr/>
+    </w:lvl>
+    <w:lvl w:ilvl="3">
+      <w:start w:val="1"/>
+      <w:numFmt w:val="decimal"/>
+      <w:lvlText w:val="%4."/>
+      <w:lvlJc w:val="left"/>
+      <w:pPr>
+        <w:tabs>
+          <w:tab w:val="num" w:pos="2836"/>
+        </w:tabs>
+        <w:ind w:left="2836" w:hanging="283"/>
+      </w:pPr>
+      <w:rPr/>
+    </w:lvl>
+    <w:lvl w:ilvl="4">
+      <w:start w:val="1"/>
+      <w:numFmt w:val="decimal"/>
+      <w:lvlText w:val="%5."/>
+      <w:lvlJc w:val="left"/>
+      <w:pPr>
+        <w:tabs>
+          <w:tab w:val="num" w:pos="3545"/>
+        </w:tabs>
+        <w:ind w:left="3545" w:hanging="283"/>
+      </w:pPr>
+      <w:rPr/>
+    </w:lvl>
+    <w:lvl w:ilvl="5">
+      <w:start w:val="1"/>
+      <w:numFmt w:val="decimal"/>
+      <w:lvlText w:val="%6."/>
+      <w:lvlJc w:val="left"/>
+      <w:pPr>
+        <w:tabs>
+          <w:tab w:val="num" w:pos="4254"/>
+        </w:tabs>
+        <w:ind w:left="4254" w:hanging="283"/>
+      </w:pPr>
+      <w:rPr/>
+    </w:lvl>
+    <w:lvl w:ilvl="6">
+      <w:start w:val="1"/>
+      <w:numFmt w:val="decimal"/>
+      <w:lvlText w:val="%7."/>
+      <w:lvlJc w:val="left"/>
+      <w:pPr>
+        <w:tabs>
+          <w:tab w:val="num" w:pos="4963"/>
+        </w:tabs>
+        <w:ind w:left="4963" w:hanging="283"/>
+      </w:pPr>
+      <w:rPr/>
+    </w:lvl>
+    <w:lvl w:ilvl="7">
+      <w:start w:val="1"/>
+      <w:numFmt w:val="decimal"/>
+      <w:lvlText w:val="%8."/>
+      <w:lvlJc w:val="left"/>
+      <w:pPr>
+        <w:tabs>
+          <w:tab w:val="num" w:pos="5672"/>
+        </w:tabs>
+        <w:ind w:left="5672" w:hanging="283"/>
+      </w:pPr>
+      <w:rPr/>
+    </w:lvl>
+    <w:lvl w:ilvl="8">
+      <w:start w:val="1"/>
+      <w:numFmt w:val="decimal"/>
+      <w:lvlText w:val="%9."/>
+      <w:lvlJc w:val="left"/>
+      <w:pPr>
+        <w:tabs>
+          <w:tab w:val="num" w:pos="6381"/>
+        </w:tabs>
+        <w:ind w:left="6381" w:hanging="283"/>
+      </w:pPr>
+      <w:rPr/>
+    </w:lvl>
+  </w:abstractNum>
+  <w:abstractNum w:abstractNumId="8">
+    <w:lvl w:ilvl="0">
+      <w:start w:val="1"/>
       <w:numFmt w:val="bullet"/>
       <w:lvlText w:val=""/>
       <w:lvlJc w:val="left"/>
@@ -9381,125 +10387,6 @@
       </w:rPr>
     </w:lvl>
   </w:abstractNum>
-  <w:abstractNum w:abstractNumId="8">
-    <w:lvl w:ilvl="0">
-      <w:start w:val="1"/>
-      <w:numFmt w:val="decimal"/>
-      <w:lvlText w:val="%1."/>
-      <w:lvlJc w:val="left"/>
-      <w:pPr>
-        <w:tabs>
-          <w:tab w:val="num" w:pos="709"/>
-        </w:tabs>
-        <w:ind w:left="709" w:hanging="283"/>
-      </w:pPr>
-      <w:rPr/>
-    </w:lvl>
-    <w:lvl w:ilvl="1">
-      <w:start w:val="1"/>
-      <w:numFmt w:val="decimal"/>
-      <w:lvlText w:val="%2."/>
-      <w:lvlJc w:val="left"/>
-      <w:pPr>
-        <w:tabs>
-          <w:tab w:val="num" w:pos="1418"/>
-        </w:tabs>
-        <w:ind w:left="1418" w:hanging="283"/>
-      </w:pPr>
-      <w:rPr/>
-    </w:lvl>
-    <w:lvl w:ilvl="2">
-      <w:start w:val="1"/>
-      <w:numFmt w:val="decimal"/>
-      <w:lvlText w:val="%3."/>
-      <w:lvlJc w:val="left"/>
-      <w:pPr>
-        <w:tabs>
-          <w:tab w:val="num" w:pos="2127"/>
-        </w:tabs>
-        <w:ind w:left="2127" w:hanging="283"/>
-      </w:pPr>
-      <w:rPr/>
-    </w:lvl>
-    <w:lvl w:ilvl="3">
-      <w:start w:val="1"/>
-      <w:numFmt w:val="decimal"/>
-      <w:lvlText w:val="%4."/>
-      <w:lvlJc w:val="left"/>
-      <w:pPr>
-        <w:tabs>
-          <w:tab w:val="num" w:pos="2836"/>
-        </w:tabs>
-        <w:ind w:left="2836" w:hanging="283"/>
-      </w:pPr>
-      <w:rPr/>
-    </w:lvl>
-    <w:lvl w:ilvl="4">
-      <w:start w:val="1"/>
-      <w:numFmt w:val="decimal"/>
-      <w:lvlText w:val="%5."/>
-      <w:lvlJc w:val="left"/>
-      <w:pPr>
-        <w:tabs>
-          <w:tab w:val="num" w:pos="3545"/>
-        </w:tabs>
-        <w:ind w:left="3545" w:hanging="283"/>
-      </w:pPr>
-      <w:rPr/>
-    </w:lvl>
-    <w:lvl w:ilvl="5">
-      <w:start w:val="1"/>
-      <w:numFmt w:val="decimal"/>
-      <w:lvlText w:val="%6."/>
-      <w:lvlJc w:val="left"/>
-      <w:pPr>
-        <w:tabs>
-          <w:tab w:val="num" w:pos="4254"/>
-        </w:tabs>
-        <w:ind w:left="4254" w:hanging="283"/>
-      </w:pPr>
-      <w:rPr/>
-    </w:lvl>
-    <w:lvl w:ilvl="6">
-      <w:start w:val="1"/>
-      <w:numFmt w:val="decimal"/>
-      <w:lvlText w:val="%7."/>
-      <w:lvlJc w:val="left"/>
-      <w:pPr>
-        <w:tabs>
-          <w:tab w:val="num" w:pos="4963"/>
-        </w:tabs>
-        <w:ind w:left="4963" w:hanging="283"/>
-      </w:pPr>
-      <w:rPr/>
-    </w:lvl>
-    <w:lvl w:ilvl="7">
-      <w:start w:val="1"/>
-      <w:numFmt w:val="decimal"/>
-      <w:lvlText w:val="%8."/>
-      <w:lvlJc w:val="left"/>
-      <w:pPr>
-        <w:tabs>
-          <w:tab w:val="num" w:pos="5672"/>
-        </w:tabs>
-        <w:ind w:left="5672" w:hanging="283"/>
-      </w:pPr>
-      <w:rPr/>
-    </w:lvl>
-    <w:lvl w:ilvl="8">
-      <w:start w:val="1"/>
-      <w:numFmt w:val="decimal"/>
-      <w:lvlText w:val="%9."/>
-      <w:lvlJc w:val="left"/>
-      <w:pPr>
-        <w:tabs>
-          <w:tab w:val="num" w:pos="6381"/>
-        </w:tabs>
-        <w:ind w:left="6381" w:hanging="283"/>
-      </w:pPr>
-      <w:rPr/>
-    </w:lvl>
-  </w:abstractNum>
   <w:abstractNum w:abstractNumId="9">
     <w:lvl w:ilvl="0">
       <w:start w:val="1"/>
@@ -9640,6 +10527,125 @@
   <w:abstractNum w:abstractNumId="10">
     <w:lvl w:ilvl="0">
       <w:start w:val="1"/>
+      <w:numFmt w:val="decimal"/>
+      <w:lvlText w:val="%1."/>
+      <w:lvlJc w:val="left"/>
+      <w:pPr>
+        <w:tabs>
+          <w:tab w:val="num" w:pos="709"/>
+        </w:tabs>
+        <w:ind w:left="709" w:hanging="283"/>
+      </w:pPr>
+      <w:rPr/>
+    </w:lvl>
+    <w:lvl w:ilvl="1">
+      <w:start w:val="1"/>
+      <w:numFmt w:val="decimal"/>
+      <w:lvlText w:val="%2."/>
+      <w:lvlJc w:val="left"/>
+      <w:pPr>
+        <w:tabs>
+          <w:tab w:val="num" w:pos="1418"/>
+        </w:tabs>
+        <w:ind w:left="1418" w:hanging="283"/>
+      </w:pPr>
+      <w:rPr/>
+    </w:lvl>
+    <w:lvl w:ilvl="2">
+      <w:start w:val="1"/>
+      <w:numFmt w:val="decimal"/>
+      <w:lvlText w:val="%3."/>
+      <w:lvlJc w:val="left"/>
+      <w:pPr>
+        <w:tabs>
+          <w:tab w:val="num" w:pos="2127"/>
+        </w:tabs>
+        <w:ind w:left="2127" w:hanging="283"/>
+      </w:pPr>
+      <w:rPr/>
+    </w:lvl>
+    <w:lvl w:ilvl="3">
+      <w:start w:val="1"/>
+      <w:numFmt w:val="decimal"/>
+      <w:lvlText w:val="%4."/>
+      <w:lvlJc w:val="left"/>
+      <w:pPr>
+        <w:tabs>
+          <w:tab w:val="num" w:pos="2836"/>
+        </w:tabs>
+        <w:ind w:left="2836" w:hanging="283"/>
+      </w:pPr>
+      <w:rPr/>
+    </w:lvl>
+    <w:lvl w:ilvl="4">
+      <w:start w:val="1"/>
+      <w:numFmt w:val="decimal"/>
+      <w:lvlText w:val="%5."/>
+      <w:lvlJc w:val="left"/>
+      <w:pPr>
+        <w:tabs>
+          <w:tab w:val="num" w:pos="3545"/>
+        </w:tabs>
+        <w:ind w:left="3545" w:hanging="283"/>
+      </w:pPr>
+      <w:rPr/>
+    </w:lvl>
+    <w:lvl w:ilvl="5">
+      <w:start w:val="1"/>
+      <w:numFmt w:val="decimal"/>
+      <w:lvlText w:val="%6."/>
+      <w:lvlJc w:val="left"/>
+      <w:pPr>
+        <w:tabs>
+          <w:tab w:val="num" w:pos="4254"/>
+        </w:tabs>
+        <w:ind w:left="4254" w:hanging="283"/>
+      </w:pPr>
+      <w:rPr/>
+    </w:lvl>
+    <w:lvl w:ilvl="6">
+      <w:start w:val="1"/>
+      <w:numFmt w:val="decimal"/>
+      <w:lvlText w:val="%7."/>
+      <w:lvlJc w:val="left"/>
+      <w:pPr>
+        <w:tabs>
+          <w:tab w:val="num" w:pos="4963"/>
+        </w:tabs>
+        <w:ind w:left="4963" w:hanging="283"/>
+      </w:pPr>
+      <w:rPr/>
+    </w:lvl>
+    <w:lvl w:ilvl="7">
+      <w:start w:val="1"/>
+      <w:numFmt w:val="decimal"/>
+      <w:lvlText w:val="%8."/>
+      <w:lvlJc w:val="left"/>
+      <w:pPr>
+        <w:tabs>
+          <w:tab w:val="num" w:pos="5672"/>
+        </w:tabs>
+        <w:ind w:left="5672" w:hanging="283"/>
+      </w:pPr>
+      <w:rPr/>
+    </w:lvl>
+    <w:lvl w:ilvl="8">
+      <w:start w:val="1"/>
+      <w:numFmt w:val="decimal"/>
+      <w:lvlText w:val="%9."/>
+      <w:lvlJc w:val="left"/>
+      <w:pPr>
+        <w:tabs>
+          <w:tab w:val="num" w:pos="6381"/>
+        </w:tabs>
+        <w:ind w:left="6381" w:hanging="283"/>
+      </w:pPr>
+      <w:rPr/>
+    </w:lvl>
+  </w:abstractNum>
+  <w:abstractNum w:abstractNumId="11">
+    <w:lvl w:ilvl="0">
+      <w:start w:val="1"/>
       <w:numFmt w:val="bullet"/>
       <w:lvlText w:val=""/>
       <w:lvlJc w:val="left"/>
@@ -9774,125 +10780,6 @@
       </w:rPr>
     </w:lvl>
   </w:abstractNum>
-  <w:abstractNum w:abstractNumId="11">
-    <w:lvl w:ilvl="0">
-      <w:start w:val="1"/>
-      <w:numFmt w:val="decimal"/>
-      <w:lvlText w:val="%1."/>
-      <w:lvlJc w:val="left"/>
-      <w:pPr>
-        <w:tabs>
-          <w:tab w:val="num" w:pos="709"/>
-        </w:tabs>
-        <w:ind w:left="709" w:hanging="283"/>
-      </w:pPr>
-      <w:rPr/>
-    </w:lvl>
-    <w:lvl w:ilvl="1">
-      <w:start w:val="1"/>
-      <w:numFmt w:val="decimal"/>
-      <w:lvlText w:val="%2."/>
-      <w:lvlJc w:val="left"/>
-      <w:pPr>
-        <w:tabs>
-          <w:tab w:val="num" w:pos="1418"/>
-        </w:tabs>
-        <w:ind w:left="1418" w:hanging="283"/>
-      </w:pPr>
-      <w:rPr/>
-    </w:lvl>
-    <w:lvl w:ilvl="2">
-      <w:start w:val="1"/>
-      <w:numFmt w:val="decimal"/>
-      <w:lvlText w:val="%3."/>
-      <w:lvlJc w:val="left"/>
-      <w:pPr>
-        <w:tabs>
-          <w:tab w:val="num" w:pos="2127"/>
-        </w:tabs>
-        <w:ind w:left="2127" w:hanging="283"/>
-      </w:pPr>
-      <w:rPr/>
-    </w:lvl>
-    <w:lvl w:ilvl="3">
-      <w:start w:val="1"/>
-      <w:numFmt w:val="decimal"/>
-      <w:lvlText w:val="%4."/>
-      <w:lvlJc w:val="left"/>
-      <w:pPr>
-        <w:tabs>
-          <w:tab w:val="num" w:pos="2836"/>
-        </w:tabs>
-        <w:ind w:left="2836" w:hanging="283"/>
-      </w:pPr>
-      <w:rPr/>
-    </w:lvl>
-    <w:lvl w:ilvl="4">
-      <w:start w:val="1"/>
-      <w:numFmt w:val="decimal"/>
-      <w:lvlText w:val="%5."/>
-      <w:lvlJc w:val="left"/>
-      <w:pPr>
-        <w:tabs>
-          <w:tab w:val="num" w:pos="3545"/>
-        </w:tabs>
-        <w:ind w:left="3545" w:hanging="283"/>
-      </w:pPr>
-      <w:rPr/>
-    </w:lvl>
-    <w:lvl w:ilvl="5">
-      <w:start w:val="1"/>
-      <w:numFmt w:val="decimal"/>
-      <w:lvlText w:val="%6."/>
-      <w:lvlJc w:val="left"/>
-      <w:pPr>
-        <w:tabs>
-          <w:tab w:val="num" w:pos="4254"/>
-        </w:tabs>
-        <w:ind w:left="4254" w:hanging="283"/>
-      </w:pPr>
-      <w:rPr/>
-    </w:lvl>
-    <w:lvl w:ilvl="6">
-      <w:start w:val="1"/>
-      <w:numFmt w:val="decimal"/>
-      <w:lvlText w:val="%7."/>
-      <w:lvlJc w:val="left"/>
-      <w:pPr>
-        <w:tabs>
-          <w:tab w:val="num" w:pos="4963"/>
-        </w:tabs>
-        <w:ind w:left="4963" w:hanging="283"/>
-      </w:pPr>
-      <w:rPr/>
-    </w:lvl>
-    <w:lvl w:ilvl="7">
-      <w:start w:val="1"/>
-      <w:numFmt w:val="decimal"/>
-      <w:lvlText w:val="%8."/>
-      <w:lvlJc w:val="left"/>
-      <w:pPr>
-        <w:tabs>
-          <w:tab w:val="num" w:pos="5672"/>
-        </w:tabs>
-        <w:ind w:left="5672" w:hanging="283"/>
-      </w:pPr>
-      <w:rPr/>
-    </w:lvl>
-    <w:lvl w:ilvl="8">
-      <w:start w:val="1"/>
-      <w:numFmt w:val="decimal"/>
-      <w:lvlText w:val="%9."/>
-      <w:lvlJc w:val="left"/>
-      <w:pPr>
-        <w:tabs>
-          <w:tab w:val="num" w:pos="6381"/>
-        </w:tabs>
-        <w:ind w:left="6381" w:hanging="283"/>
-      </w:pPr>
-      <w:rPr/>
-    </w:lvl>
-  </w:abstractNum>
   <w:abstractNum w:abstractNumId="12">
     <w:lvl w:ilvl="0">
       <w:start w:val="1"/>
@@ -10031,6 +10918,399 @@
     </w:lvl>
   </w:abstractNum>
   <w:abstractNum w:abstractNumId="13">
+    <w:lvl w:ilvl="0">
+      <w:start w:val="1"/>
+      <w:numFmt w:val="decimal"/>
+      <w:lvlText w:val="%1."/>
+      <w:lvlJc w:val="left"/>
+      <w:pPr>
+        <w:tabs>
+          <w:tab w:val="num" w:pos="709"/>
+        </w:tabs>
+        <w:ind w:left="709" w:hanging="283"/>
+      </w:pPr>
+      <w:rPr/>
+    </w:lvl>
+    <w:lvl w:ilvl="1">
+      <w:start w:val="1"/>
+      <w:numFmt w:val="decimal"/>
+      <w:lvlText w:val="%2."/>
+      <w:lvlJc w:val="left"/>
+      <w:pPr>
+        <w:tabs>
+          <w:tab w:val="num" w:pos="1418"/>
+        </w:tabs>
+        <w:ind w:left="1418" w:hanging="283"/>
+      </w:pPr>
+      <w:rPr/>
+    </w:lvl>
+    <w:lvl w:ilvl="2">
+      <w:start w:val="1"/>
+      <w:numFmt w:val="decimal"/>
+      <w:lvlText w:val="%3."/>
+      <w:lvlJc w:val="left"/>
+      <w:pPr>
+        <w:tabs>
+          <w:tab w:val="num" w:pos="2127"/>
+        </w:tabs>
+        <w:ind w:left="2127" w:hanging="283"/>
+      </w:pPr>
+      <w:rPr/>
+    </w:lvl>
+    <w:lvl w:ilvl="3">
+      <w:start w:val="1"/>
+      <w:numFmt w:val="decimal"/>
+      <w:lvlText w:val="%4."/>
+      <w:lvlJc w:val="left"/>
+      <w:pPr>
+        <w:tabs>
+          <w:tab w:val="num" w:pos="2836"/>
+        </w:tabs>
+        <w:ind w:left="2836" w:hanging="283"/>
+      </w:pPr>
+      <w:rPr/>
+    </w:lvl>
+    <w:lvl w:ilvl="4">
+      <w:start w:val="1"/>
+      <w:numFmt w:val="decimal"/>
+      <w:lvlText w:val="%5."/>
+      <w:lvlJc w:val="left"/>
+      <w:pPr>
+        <w:tabs>
+          <w:tab w:val="num" w:pos="3545"/>
+        </w:tabs>
+        <w:ind w:left="3545" w:hanging="283"/>
+      </w:pPr>
+      <w:rPr/>
+    </w:lvl>
+    <w:lvl w:ilvl="5">
+      <w:start w:val="1"/>
+      <w:numFmt w:val="decimal"/>
+      <w:lvlText w:val="%6."/>
+      <w:lvlJc w:val="left"/>
+      <w:pPr>
+        <w:tabs>
+          <w:tab w:val="num" w:pos="4254"/>
+        </w:tabs>
+        <w:ind w:left="4254" w:hanging="283"/>
+      </w:pPr>
+      <w:rPr/>
+    </w:lvl>
+    <w:lvl w:ilvl="6">
+      <w:start w:val="1"/>
+      <w:numFmt w:val="decimal"/>
+      <w:lvlText w:val="%7."/>
+      <w:lvlJc w:val="left"/>
+      <w:pPr>
+        <w:tabs>
+          <w:tab w:val="num" w:pos="4963"/>
+        </w:tabs>
+        <w:ind w:left="4963" w:hanging="283"/>
+      </w:pPr>
+      <w:rPr/>
+    </w:lvl>
+    <w:lvl w:ilvl="7">
+      <w:start w:val="1"/>
+      <w:numFmt w:val="decimal"/>
+      <w:lvlText w:val="%8."/>
+      <w:lvlJc w:val="left"/>
+      <w:pPr>
+        <w:tabs>
+          <w:tab w:val="num" w:pos="5672"/>
+        </w:tabs>
+        <w:ind w:left="5672" w:hanging="283"/>
+      </w:pPr>
+      <w:rPr/>
+    </w:lvl>
+    <w:lvl w:ilvl="8">
+      <w:start w:val="1"/>
+      <w:numFmt w:val="decimal"/>
+      <w:lvlText w:val="%9."/>
+      <w:lvlJc w:val="left"/>
+      <w:pPr>
+        <w:tabs>
+          <w:tab w:val="num" w:pos="6381"/>
+        </w:tabs>
+        <w:ind w:left="6381" w:hanging="283"/>
+      </w:pPr>
+      <w:rPr/>
+    </w:lvl>
+  </w:abstractNum>
+  <w:abstractNum w:abstractNumId="14">
+    <w:lvl w:ilvl="0">
+      <w:start w:val="1"/>
+      <w:numFmt w:val="bullet"/>
+      <w:lvlText w:val=""/>
+      <w:lvlJc w:val="left"/>
+      <w:pPr>
+        <w:tabs>
+          <w:tab w:val="num" w:pos="709"/>
+        </w:tabs>
+        <w:ind w:left="709" w:hanging="283"/>
+      </w:pPr>
+      <w:rPr>
+        <w:rFonts w:ascii="Symbol" w:hAnsi="Symbol" w:cs="Symbol" w:hint="default"/>
+      </w:rPr>
+    </w:lvl>
+    <w:lvl w:ilvl="1">
+      <w:start w:val="1"/>
+      <w:numFmt w:val="bullet"/>
+      <w:lvlText w:val=""/>
+      <w:lvlJc w:val="left"/>
+      <w:pPr>
+        <w:tabs>
+          <w:tab w:val="num" w:pos="1418"/>
+        </w:tabs>
+        <w:ind w:left="1418" w:hanging="283"/>
+      </w:pPr>
+      <w:rPr>
+        <w:rFonts w:ascii="Symbol" w:hAnsi="Symbol" w:cs="Symbol" w:hint="default"/>
+      </w:rPr>
+    </w:lvl>
+    <w:lvl w:ilvl="2">
+      <w:start w:val="1"/>
+      <w:numFmt w:val="bullet"/>
+      <w:lvlText w:val=""/>
+      <w:lvlJc w:val="left"/>
+      <w:pPr>
+        <w:tabs>
+          <w:tab w:val="num" w:pos="2127"/>
+        </w:tabs>
+        <w:ind w:left="2127" w:hanging="283"/>
+      </w:pPr>
+      <w:rPr>
+        <w:rFonts w:ascii="Symbol" w:hAnsi="Symbol" w:cs="Symbol" w:hint="default"/>
+      </w:rPr>
+    </w:lvl>
+    <w:lvl w:ilvl="3">
+      <w:start w:val="1"/>
+      <w:numFmt w:val="bullet"/>
+      <w:lvlText w:val=""/>
+      <w:lvlJc w:val="left"/>
+      <w:pPr>
+        <w:tabs>
+          <w:tab w:val="num" w:pos="2836"/>
+        </w:tabs>
+        <w:ind w:left="2836" w:hanging="283"/>
+      </w:pPr>
+      <w:rPr>
+        <w:rFonts w:ascii="Symbol" w:hAnsi="Symbol" w:cs="Symbol" w:hint="default"/>
+      </w:rPr>
+    </w:lvl>
+    <w:lvl w:ilvl="4">
+      <w:start w:val="1"/>
+      <w:numFmt w:val="bullet"/>
+      <w:lvlText w:val=""/>
+      <w:lvlJc w:val="left"/>
+      <w:pPr>
+        <w:tabs>
+          <w:tab w:val="num" w:pos="3545"/>
+        </w:tabs>
+        <w:ind w:left="3545" w:hanging="283"/>
+      </w:pPr>
+      <w:rPr>
+        <w:rFonts w:ascii="Symbol" w:hAnsi="Symbol" w:cs="Symbol" w:hint="default"/>
+      </w:rPr>
+    </w:lvl>
+    <w:lvl w:ilvl="5">
+      <w:start w:val="1"/>
+      <w:numFmt w:val="bullet"/>
+      <w:lvlText w:val=""/>
+      <w:lvlJc w:val="left"/>
+      <w:pPr>
+        <w:tabs>
+          <w:tab w:val="num" w:pos="4254"/>
+        </w:tabs>
+        <w:ind w:left="4254" w:hanging="283"/>
+      </w:pPr>
+      <w:rPr>
+        <w:rFonts w:ascii="Symbol" w:hAnsi="Symbol" w:cs="Symbol" w:hint="default"/>
+      </w:rPr>
+    </w:lvl>
+    <w:lvl w:ilvl="6">
+      <w:start w:val="1"/>
+      <w:numFmt w:val="bullet"/>
+      <w:lvlText w:val=""/>
+      <w:lvlJc w:val="left"/>
+      <w:pPr>
+        <w:tabs>
+          <w:tab w:val="num" w:pos="4963"/>
+        </w:tabs>
+        <w:ind w:left="4963" w:hanging="283"/>
+      </w:pPr>
+      <w:rPr>
+        <w:rFonts w:ascii="Symbol" w:hAnsi="Symbol" w:cs="Symbol" w:hint="default"/>
+      </w:rPr>
+    </w:lvl>
+    <w:lvl w:ilvl="7">
+      <w:start w:val="1"/>
+      <w:numFmt w:val="bullet"/>
+      <w:lvlText w:val=""/>
+      <w:lvlJc w:val="left"/>
+      <w:pPr>
+        <w:tabs>
+          <w:tab w:val="num" w:pos="5672"/>
+        </w:tabs>
+        <w:ind w:left="5672" w:hanging="283"/>
+      </w:pPr>
+      <w:rPr>
+        <w:rFonts w:ascii="Symbol" w:hAnsi="Symbol" w:cs="Symbol" w:hint="default"/>
+      </w:rPr>
+    </w:lvl>
+    <w:lvl w:ilvl="8">
+      <w:start w:val="1"/>
+      <w:numFmt w:val="bullet"/>
+      <w:lvlText w:val=""/>
+      <w:lvlJc w:val="left"/>
+      <w:pPr>
+        <w:tabs>
+          <w:tab w:val="num" w:pos="6381"/>
+        </w:tabs>
+        <w:ind w:left="6381" w:hanging="283"/>
+      </w:pPr>
+      <w:rPr>
+        <w:rFonts w:ascii="Symbol" w:hAnsi="Symbol" w:cs="Symbol" w:hint="default"/>
+      </w:rPr>
+    </w:lvl>
+  </w:abstractNum>
+  <w:abstractNum w:abstractNumId="15">
+    <w:lvl w:ilvl="0">
+      <w:start w:val="1"/>
+      <w:numFmt w:val="bullet"/>
+      <w:lvlText w:val=""/>
+      <w:lvlJc w:val="left"/>
+      <w:pPr>
+        <w:tabs>
+          <w:tab w:val="num" w:pos="709"/>
+        </w:tabs>
+        <w:ind w:left="709" w:hanging="283"/>
+      </w:pPr>
+      <w:rPr>
+        <w:rFonts w:ascii="Symbol" w:hAnsi="Symbol" w:cs="Symbol" w:hint="default"/>
+      </w:rPr>
+    </w:lvl>
+    <w:lvl w:ilvl="1">
+      <w:start w:val="1"/>
+      <w:numFmt w:val="bullet"/>
+      <w:lvlText w:val=""/>
+      <w:lvlJc w:val="left"/>
+      <w:pPr>
+        <w:tabs>
+          <w:tab w:val="num" w:pos="1418"/>
+        </w:tabs>
+        <w:ind w:left="1418" w:hanging="283"/>
+      </w:pPr>
+      <w:rPr>
+        <w:rFonts w:ascii="Symbol" w:hAnsi="Symbol" w:cs="Symbol" w:hint="default"/>
+      </w:rPr>
+    </w:lvl>
+    <w:lvl w:ilvl="2">
+      <w:start w:val="1"/>
+      <w:numFmt w:val="bullet"/>
+      <w:lvlText w:val=""/>
+      <w:lvlJc w:val="left"/>
+      <w:pPr>
+        <w:tabs>
+          <w:tab w:val="num" w:pos="2127"/>
+        </w:tabs>
+        <w:ind w:left="2127" w:hanging="283"/>
+      </w:pPr>
+      <w:rPr>
+        <w:rFonts w:ascii="Symbol" w:hAnsi="Symbol" w:cs="Symbol" w:hint="default"/>
+      </w:rPr>
+    </w:lvl>
+    <w:lvl w:ilvl="3">
+      <w:start w:val="1"/>
+      <w:numFmt w:val="bullet"/>
+      <w:lvlText w:val=""/>
+      <w:lvlJc w:val="left"/>
+      <w:pPr>
+        <w:tabs>
+          <w:tab w:val="num" w:pos="2836"/>
+        </w:tabs>
+        <w:ind w:left="2836" w:hanging="283"/>
+      </w:pPr>
+      <w:rPr>
+        <w:rFonts w:ascii="Symbol" w:hAnsi="Symbol" w:cs="Symbol" w:hint="default"/>
+      </w:rPr>
+    </w:lvl>
+    <w:lvl w:ilvl="4">
+      <w:start w:val="1"/>
+      <w:numFmt w:val="bullet"/>
+      <w:lvlText w:val=""/>
+      <w:lvlJc w:val="left"/>
+      <w:pPr>
+        <w:tabs>
+          <w:tab w:val="num" w:pos="3545"/>
+        </w:tabs>
+        <w:ind w:left="3545" w:hanging="283"/>
+      </w:pPr>
+      <w:rPr>
+        <w:rFonts w:ascii="Symbol" w:hAnsi="Symbol" w:cs="Symbol" w:hint="default"/>
+      </w:rPr>
+    </w:lvl>
+    <w:lvl w:ilvl="5">
+      <w:start w:val="1"/>
+      <w:numFmt w:val="bullet"/>
+      <w:lvlText w:val=""/>
+      <w:lvlJc w:val="left"/>
+      <w:pPr>
+        <w:tabs>
+          <w:tab w:val="num" w:pos="4254"/>
+        </w:tabs>
+        <w:ind w:left="4254" w:hanging="283"/>
+      </w:pPr>
+      <w:rPr>
+        <w:rFonts w:ascii="Symbol" w:hAnsi="Symbol" w:cs="Symbol" w:hint="default"/>
+      </w:rPr>
+    </w:lvl>
+    <w:lvl w:ilvl="6">
+      <w:start w:val="1"/>
+      <w:numFmt w:val="bullet"/>
+      <w:lvlText w:val=""/>
+      <w:lvlJc w:val="left"/>
+      <w:pPr>
+        <w:tabs>
+          <w:tab w:val="num" w:pos="4963"/>
+        </w:tabs>
+        <w:ind w:left="4963" w:hanging="283"/>
+      </w:pPr>
+      <w:rPr>
+        <w:rFonts w:ascii="Symbol" w:hAnsi="Symbol" w:cs="Symbol" w:hint="default"/>
+      </w:rPr>
+    </w:lvl>
+    <w:lvl w:ilvl="7">
+      <w:start w:val="1"/>
+      <w:numFmt w:val="bullet"/>
+      <w:lvlText w:val=""/>
+      <w:lvlJc w:val="left"/>
+      <w:pPr>
+        <w:tabs>
+          <w:tab w:val="num" w:pos="5672"/>
+        </w:tabs>
+        <w:ind w:left="5672" w:hanging="283"/>
+      </w:pPr>
+      <w:rPr>
+        <w:rFonts w:ascii="Symbol" w:hAnsi="Symbol" w:cs="Symbol" w:hint="default"/>
+      </w:rPr>
+    </w:lvl>
+    <w:lvl w:ilvl="8">
+      <w:start w:val="1"/>
+      <w:numFmt w:val="bullet"/>
+      <w:lvlText w:val=""/>
+      <w:lvlJc w:val="left"/>
+      <w:pPr>
+        <w:tabs>
+          <w:tab w:val="num" w:pos="6381"/>
+        </w:tabs>
+        <w:ind w:left="6381" w:hanging="283"/>
+      </w:pPr>
+      <w:rPr>
+        <w:rFonts w:ascii="Symbol" w:hAnsi="Symbol" w:cs="Symbol" w:hint="default"/>
+      </w:rPr>
+    </w:lvl>
+  </w:abstractNum>
+  <w:abstractNum w:abstractNumId="16">
     <w:lvl w:ilvl="0">
       <w:start w:val="1"/>
       <w:numFmt w:val="none"/>
@@ -10189,6 +11469,15 @@
   </w:num>
   <w:num w:numId="13">
     <w:abstractNumId w:val="13"/>
+  </w:num>
+  <w:num w:numId="14">
+    <w:abstractNumId w:val="14"/>
+  </w:num>
+  <w:num w:numId="15">
+    <w:abstractNumId w:val="15"/>
+  </w:num>
+  <w:num w:numId="16">
+    <w:abstractNumId w:val="16"/>
   </w:num>
 </w:numbering>
 </file>

</xml_diff>